<commit_message>
Update CCF experiment documents with GUI screenshots and generic prompts
Co-authored-by: SayyadFaizan <141846057+SayyadFaizan@users.noreply.github.com>
</commit_message>
<xml_diff>
--- a/CCF/CCF PRA/EXP02.docx
+++ b/CCF/CCF PRA/EXP02.docx
@@ -146,7 +146,7 @@
         </w:rPr>
         <w:t>• Understand Virtualization, Hypervisors (Type 1 vs Type 2), and KVM architecture.</w:t>
         <w:br/>
-        <w:t>• Verify hardware virtualization support on Linux host using CLI.</w:t>
+        <w:t>• Check hardware virtualization support on Linux using CLI commands.</w:t>
         <w:br/>
         <w:t>• Install KVM, QEMU, libvirt, and virt-manager packages.</w:t>
         <w:br/>
@@ -190,7 +190,7 @@
           <w:rFonts w:ascii="Calibri" w:hAnsi="Calibri"/>
           <w:sz w:val="22"/>
         </w:rPr>
-        <w:t>Virtualization allows a physical machine to run multiple isolated guest operating systems simultaneously. A Hypervisor or Virtual Machine Monitor (VMM) abstracts physical vCPU, RAM, and storage hardware. Type 1 (bare-metal) hypervisors run directly on hardware or integrate into the kernel (e.g., KVM, Xen, ESXi). Type 2 hypervisors run on top of an host OS (e.g., VirtualBox).</w:t>
+        <w:t>Virtualization enables a physical computer to run multiple isolated virtual machines (VMs). A Hypervisor or Virtual Machine Monitor (VMM) allocates physical vCPU, RAM, and storage hardware. Type 1 (bare-metal) hypervisors run directly on hardware or integrate closely into the host kernel (e.g., KVM, Xen, ESXi). Type 2 hypervisors run as applications on top of a host OS (e.g., VirtualBox).</w:t>
       </w:r>
     </w:p>
     <w:p>
@@ -317,7 +317,7 @@
           <w:rFonts w:ascii="Calibri" w:hAnsi="Calibri"/>
           <w:sz w:val="22"/>
         </w:rPr>
-        <w:t>Note: Output returns 0 inside container environments where nested virtualization flags are not exposed by the underlying host kernel.</w:t>
+        <w:t>Note: Output returns 0 inside container environments where nested hardware virtualization flags are not exposed by the underlying host kernel.</w:t>
       </w:r>
     </w:p>
     <w:p>
@@ -500,7 +500,7 @@
       <w:r>
         <w:drawing>
           <wp:inline xmlns:a="http://schemas.openxmlformats.org/drawingml/2006/main" xmlns:pic="http://schemas.openxmlformats.org/drawingml/2006/picture">
-            <wp:extent cx="5486400" cy="3055716"/>
+            <wp:extent cx="5486400" cy="3048000"/>
             <wp:docPr id="4" name="Picture 4"/>
             <wp:cNvGraphicFramePr>
               <a:graphicFrameLocks noChangeAspect="1"/>
@@ -521,7 +521,7 @@
                   <pic:spPr>
                     <a:xfrm>
                       <a:off x="0" y="0"/>
-                      <a:ext cx="5486400" cy="3055716"/>
+                      <a:ext cx="5486400" cy="3048000"/>
                     </a:xfrm>
                     <a:prstGeom prst="rect"/>
                   </pic:spPr>
@@ -562,7 +562,7 @@
       <w:r>
         <w:drawing>
           <wp:inline xmlns:a="http://schemas.openxmlformats.org/drawingml/2006/main" xmlns:pic="http://schemas.openxmlformats.org/drawingml/2006/picture">
-            <wp:extent cx="5486400" cy="3151457"/>
+            <wp:extent cx="5486400" cy="3048000"/>
             <wp:docPr id="5" name="Picture 5"/>
             <wp:cNvGraphicFramePr>
               <a:graphicFrameLocks noChangeAspect="1"/>
@@ -583,7 +583,7 @@
                   <pic:spPr>
                     <a:xfrm>
                       <a:off x="0" y="0"/>
-                      <a:ext cx="5486400" cy="3151457"/>
+                      <a:ext cx="5486400" cy="3048000"/>
                     </a:xfrm>
                     <a:prstGeom prst="rect"/>
                   </pic:spPr>
@@ -662,7 +662,7 @@
         <w:rPr>
           <w:sz w:val="21"/>
         </w:rPr>
-        <w:t xml:space="preserve">Ans: </w:t>
+        <w:t>Ans: `egrep -c '(vmx|svm)' /proc/cpuinfo`</w:t>
       </w:r>
     </w:p>
     <w:p>
@@ -674,14 +674,14 @@
           <w:b/>
           <w:sz w:val="21"/>
         </w:rPr>
-        <w:t>Q4: What is ?</w:t>
+        <w:t>Q4: What is `virsh`?</w:t>
         <w:br/>
       </w:r>
       <w:r>
         <w:rPr>
           <w:sz w:val="21"/>
         </w:rPr>
-        <w:t>Ans:  is the main management CLI utility for controlling libvirt domains/VMs.</w:t>
+        <w:t>Ans: `virsh` is the main management CLI utility for controlling libvirt domains/VMs.</w:t>
       </w:r>
     </w:p>
     <w:p>

</xml_diff>